<commit_message>
feat(tools): enhance markdown-to-word converter with table processing support
- Add table parsing and rendering from markdown to Word documents
- Refactor metadata replacement logic for improved efficiency
- Replace class diagram image with updated version in IMG folder
- Update .gitignore to include __pycache__/
</commit_message>
<xml_diff>
--- a/docs/Modelado.docx
+++ b/docs/Modelado.docx
@@ -300,7 +300,7 @@
         </w:rPr>
         <w:t>Ingeniería de Software</w:t>
         <w:br/>
-        <w:t>{{escuela}}</w:t>
+        <w:t>Escuela de Transformación Digital</w:t>
       </w:r>
       <w:r/>
       <w:r>
@@ -311,6 +311,22 @@
           <w:szCs w:val="28"/>
         </w:rPr>
       </w:r>
+      <w:r>
+        <w:rPr>
+          <w:rFonts w:eastAsia="Times New Roman" w:cs="Times New Roman"/>
+          <w:color w:val="000000" w:themeColor="text1"/>
+          <w:sz w:val="28"/>
+          <w:szCs w:val="28"/>
+        </w:rPr>
+      </w:r>
+      <w:r>
+        <w:rPr>
+          <w:rFonts w:eastAsia="Times New Roman" w:cs="Times New Roman"/>
+          <w:color w:val="000000" w:themeColor="text1"/>
+          <w:sz w:val="28"/>
+          <w:szCs w:val="28"/>
+        </w:rPr>
+      </w:r>
     </w:p>
     <w:p>
       <w:pPr>
@@ -578,6 +594,187 @@
       </w:r>
     </w:p>
     <w:p/>
+    <w:tbl>
+      <w:tblPr>
+        <w:tblStyle w:val="Tablaconcuadrcula"/>
+        <w:tblW w:type="auto" w:w="0"/>
+        <w:tblLook w:firstColumn="1" w:firstRow="1" w:lastColumn="0" w:lastRow="0" w:noHBand="0" w:noVBand="1" w:val="04A0"/>
+      </w:tblPr>
+      <w:tblGrid>
+        <w:gridCol w:w="3135"/>
+        <w:gridCol w:w="3135"/>
+        <w:gridCol w:w="3135"/>
+      </w:tblGrid>
+      <w:tr>
+        <w:tc>
+          <w:tcPr>
+            <w:tcW w:type="dxa" w:w="3135"/>
+          </w:tcPr>
+          <w:p>
+            <w:r>
+              <w:rPr>
+                <w:b/>
+              </w:rPr>
+              <w:t>Usuario</w:t>
+            </w:r>
+          </w:p>
+        </w:tc>
+        <w:tc>
+          <w:tcPr>
+            <w:tcW w:type="dxa" w:w="3135"/>
+          </w:tcPr>
+          <w:p>
+            <w:r>
+              <w:rPr>
+                <w:b/>
+              </w:rPr>
+              <w:t>Descripción</w:t>
+            </w:r>
+          </w:p>
+        </w:tc>
+        <w:tc>
+          <w:tcPr>
+            <w:tcW w:type="dxa" w:w="3135"/>
+          </w:tcPr>
+          <w:p>
+            <w:r>
+              <w:rPr>
+                <w:b/>
+              </w:rPr>
+              <w:t>Interacción Principal</w:t>
+            </w:r>
+          </w:p>
+        </w:tc>
+      </w:tr>
+      <w:tr>
+        <w:tc>
+          <w:tcPr>
+            <w:tcW w:type="dxa" w:w="3135"/>
+          </w:tcPr>
+          <w:p>
+            <w:r>
+              <w:t>**Reportador de Incidentes**</w:t>
+            </w:r>
+          </w:p>
+        </w:tc>
+        <w:tc>
+          <w:tcPr>
+            <w:tcW w:type="dxa" w:w="3135"/>
+          </w:tcPr>
+          <w:p>
+            <w:r>
+              <w:t>Empleados de TechSolutions que reportan problemas técnicos</w:t>
+            </w:r>
+          </w:p>
+        </w:tc>
+        <w:tc>
+          <w:tcPr>
+            <w:tcW w:type="dxa" w:w="3135"/>
+          </w:tcPr>
+          <w:p>
+            <w:r>
+              <w:t>Crear nuevos tickets describiendo el incidente</w:t>
+            </w:r>
+          </w:p>
+        </w:tc>
+      </w:tr>
+      <w:tr>
+        <w:tc>
+          <w:tcPr>
+            <w:tcW w:type="dxa" w:w="3135"/>
+          </w:tcPr>
+          <w:p>
+            <w:r>
+              <w:t>**Técnico de Soporte**</w:t>
+            </w:r>
+          </w:p>
+        </w:tc>
+        <w:tc>
+          <w:tcPr>
+            <w:tcW w:type="dxa" w:w="3135"/>
+          </w:tcPr>
+          <w:p>
+            <w:r>
+              <w:t>Personal encargado de resolver los incidentes</w:t>
+            </w:r>
+          </w:p>
+        </w:tc>
+        <w:tc>
+          <w:tcPr>
+            <w:tcW w:type="dxa" w:w="3135"/>
+          </w:tcPr>
+          <w:p>
+            <w:r>
+              <w:t>Recibir incidentes priorizados automáticamente y actualizar su estado</w:t>
+            </w:r>
+          </w:p>
+        </w:tc>
+      </w:tr>
+      <w:tr>
+        <w:tc>
+          <w:tcPr>
+            <w:tcW w:type="dxa" w:w="3135"/>
+          </w:tcPr>
+          <w:p>
+            <w:r>
+              <w:t>**Administrador de Sistema**</w:t>
+            </w:r>
+          </w:p>
+        </w:tc>
+        <w:tc>
+          <w:tcPr>
+            <w:tcW w:type="dxa" w:w="3135"/>
+          </w:tcPr>
+          <w:p>
+            <w:r>
+              <w:t>Gestor IT que supervisa el sistema</w:t>
+            </w:r>
+          </w:p>
+        </w:tc>
+        <w:tc>
+          <w:tcPr>
+            <w:tcW w:type="dxa" w:w="3135"/>
+          </w:tcPr>
+          <w:p>
+            <w:r>
+              <w:t>Configurar reglas de priorización, revisar decisiones de IA y generar reportes</w:t>
+            </w:r>
+          </w:p>
+        </w:tc>
+      </w:tr>
+      <w:tr>
+        <w:tc>
+          <w:tcPr>
+            <w:tcW w:type="dxa" w:w="3135"/>
+          </w:tcPr>
+          <w:p>
+            <w:r>
+              <w:t>**Supervisor de Incidentes**</w:t>
+            </w:r>
+          </w:p>
+        </w:tc>
+        <w:tc>
+          <w:tcPr>
+            <w:tcW w:type="dxa" w:w="3135"/>
+          </w:tcPr>
+          <w:p>
+            <w:r>
+              <w:t>Responsable de la calidad del servicio</w:t>
+            </w:r>
+          </w:p>
+        </w:tc>
+        <w:tc>
+          <w:tcPr>
+            <w:tcW w:type="dxa" w:w="3135"/>
+          </w:tcPr>
+          <w:p>
+            <w:r>
+              <w:t>Monitorear métricas, validar prioridades asignadas y ajustar criterios</w:t>
+            </w:r>
+          </w:p>
+        </w:tc>
+      </w:tr>
+    </w:tbl>
     <w:p/>
     <w:p>
       <w:r>
@@ -876,435 +1073,43 @@
       <w:r/>
     </w:p>
     <w:p/>
-    <w:p/>
-    <w:p>
-      <w:r>
-        <w:t>```</w:t>
-      </w:r>
-    </w:p>
-    <w:p>
-      <w:r>
-        <w:t>┌─────────────────────────┐</w:t>
-      </w:r>
-    </w:p>
-    <w:p>
-      <w:r>
-        <w:t>│      INCIDENTE          │</w:t>
-      </w:r>
-    </w:p>
-    <w:p>
-      <w:r>
-        <w:t>├─────────────────────────┤</w:t>
-      </w:r>
-    </w:p>
-    <w:p>
-      <w:r>
-        <w:rPr>
-          <w:i/>
-        </w:rPr>
-        <w:t>│ - idincidente          │</w:t>
-      </w:r>
-    </w:p>
-    <w:p>
-      <w:r>
-        <w:t>│ - titulo                │</w:t>
-      </w:r>
-    </w:p>
-    <w:p>
-      <w:r>
-        <w:t>│ - descripcion           │</w:t>
-      </w:r>
-    </w:p>
-    <w:p>
-      <w:r>
-        <w:t>│ - categoria             │</w:t>
-      </w:r>
-    </w:p>
-    <w:p>
-      <w:r>
-        <w:rPr>
-          <w:i/>
-        </w:rPr>
-        <w:t>│ - severidadreportada   │</w:t>
-      </w:r>
-    </w:p>
-    <w:p>
-      <w:r>
-        <w:rPr>
-          <w:i/>
-        </w:rPr>
-        <w:t>│ - fechacreacion        │</w:t>
-      </w:r>
-    </w:p>
-    <w:p>
-      <w:r>
-        <w:rPr>
-          <w:i/>
-        </w:rPr>
-        <w:t>│ - idreportador         │</w:t>
-      </w:r>
-    </w:p>
-    <w:p>
-      <w:r>
-        <w:rPr>
-          <w:i/>
-        </w:rPr>
-        <w:t>│ - prioridadasignada    │</w:t>
-      </w:r>
-    </w:p>
-    <w:p>
-      <w:r>
-        <w:rPr>
-          <w:i/>
-        </w:rPr>
-        <w:t>│ - justificacionia      │</w:t>
-      </w:r>
-    </w:p>
-    <w:p>
-      <w:r>
-        <w:rPr>
-          <w:i/>
-        </w:rPr>
-        <w:t>│ - embeddingsemantico   │</w:t>
-      </w:r>
-    </w:p>
-    <w:p>
-      <w:r>
-        <w:t>└────────┬────────────────┘</w:t>
-      </w:r>
-    </w:p>
-    <w:p>
-      <w:r>
-        <w:t>│</w:t>
-      </w:r>
-    </w:p>
-    <w:p>
-      <w:r>
-        <w:rPr>
-          <w:i/>
-        </w:rPr>
-        <w:t>│ asignadoa</w:t>
-      </w:r>
-    </w:p>
-    <w:p>
-      <w:r>
-        <w:t>│</w:t>
-      </w:r>
-    </w:p>
-    <w:p>
-      <w:r>
-        <w:t>▼</w:t>
-      </w:r>
-    </w:p>
-    <w:p>
-      <w:r>
-        <w:t>┌─────────────────────────┐</w:t>
-      </w:r>
-    </w:p>
-    <w:p>
-      <w:r>
-        <w:t>│      TECNICO            │</w:t>
-      </w:r>
-    </w:p>
-    <w:p>
-      <w:r>
-        <w:t>├─────────────────────────┤</w:t>
-      </w:r>
-    </w:p>
-    <w:p>
-      <w:r>
-        <w:rPr>
-          <w:i/>
-        </w:rPr>
-        <w:t>│ - idtecnico            │</w:t>
-      </w:r>
-    </w:p>
-    <w:p>
-      <w:r>
-        <w:t>│ - nombre                │</w:t>
-      </w:r>
-    </w:p>
-    <w:p>
-      <w:r>
-        <w:t>│ - especialidad          │</w:t>
-      </w:r>
-    </w:p>
-    <w:p>
-      <w:r>
-        <w:rPr>
-          <w:i/>
-        </w:rPr>
-        <w:t>│ - cargatrabajo         │</w:t>
-      </w:r>
-    </w:p>
-    <w:p>
-      <w:r>
-        <w:t>│ - disponibilidad        │</w:t>
-      </w:r>
-    </w:p>
-    <w:p>
-      <w:r>
-        <w:t>└─────────────────────────┘</w:t>
-      </w:r>
-    </w:p>
-    <w:p/>
-    <w:p>
-      <w:r>
-        <w:t>┌─────────────────────────┐</w:t>
-      </w:r>
-    </w:p>
-    <w:p>
-      <w:r>
-        <w:rPr>
-          <w:i/>
-        </w:rPr>
-        <w:t>│   PRIORIDADIA          │ ◄──── INTELIGENCIA ARTIFICIAL</w:t>
-      </w:r>
-    </w:p>
-    <w:p>
-      <w:r>
-        <w:t>├─────────────────────────┤       (Módulo de Decisión)</w:t>
-      </w:r>
-    </w:p>
-    <w:p>
-      <w:r>
-        <w:rPr>
-          <w:i/>
-        </w:rPr>
-        <w:t>│ - idprioridad          │</w:t>
-      </w:r>
-    </w:p>
-    <w:p>
-      <w:r>
-        <w:t>│ - nivel (P1/P2/P3/P4)   │</w:t>
-      </w:r>
-    </w:p>
-    <w:p>
-      <w:r>
-        <w:rPr>
-          <w:i/>
-        </w:rPr>
-        <w:t>│ - scoreconfianza       │</w:t>
-      </w:r>
-    </w:p>
-    <w:p>
-      <w:r>
-        <w:rPr>
-          <w:i/>
-        </w:rPr>
-        <w:t>│ - motivodecision       │</w:t>
-      </w:r>
-    </w:p>
-    <w:p>
-      <w:r>
-        <w:rPr>
-          <w:i/>
-        </w:rPr>
-        <w:t>│ - incidentessimilares  │</w:t>
-      </w:r>
-    </w:p>
-    <w:p>
-      <w:r>
-        <w:rPr>
-          <w:i/>
-        </w:rPr>
-        <w:t>│ - aplicablesla         │</w:t>
-      </w:r>
-    </w:p>
-    <w:p>
-      <w:r>
-        <w:t>└────────┬────────────────┘</w:t>
-      </w:r>
-    </w:p>
-    <w:p>
-      <w:r>
-        <w:t>│</w:t>
-      </w:r>
-    </w:p>
-    <w:p>
-      <w:r>
-        <w:t>│ genera</w:t>
-      </w:r>
-    </w:p>
-    <w:p>
-      <w:r>
-        <w:t>│</w:t>
-      </w:r>
-    </w:p>
-    <w:p>
-      <w:r>
-        <w:t>▼</w:t>
-      </w:r>
-    </w:p>
-    <w:p>
-      <w:r>
-        <w:t>┌─────────────────────────┐</w:t>
-      </w:r>
-    </w:p>
-    <w:p>
-      <w:r>
-        <w:rPr>
-          <w:i/>
-        </w:rPr>
-        <w:t>│  HISTORIALINCIDENTE    │</w:t>
-      </w:r>
-    </w:p>
-    <w:p>
-      <w:r>
-        <w:t>├─────────────────────────┤</w:t>
-      </w:r>
-    </w:p>
-    <w:p>
-      <w:r>
-        <w:rPr>
-          <w:i/>
-        </w:rPr>
-        <w:t>│ - idhistorial          │</w:t>
-      </w:r>
-    </w:p>
-    <w:p>
-      <w:r>
-        <w:rPr>
-          <w:i/>
-        </w:rPr>
-        <w:t>│ - idincidente          │</w:t>
-      </w:r>
-    </w:p>
-    <w:p>
-      <w:r>
-        <w:rPr>
-          <w:i/>
-        </w:rPr>
-        <w:t>│ - estadoanterior       │</w:t>
-      </w:r>
-    </w:p>
-    <w:p>
-      <w:r>
-        <w:rPr>
-          <w:i/>
-        </w:rPr>
-        <w:t>│ - estadonuevo          │</w:t>
-      </w:r>
-    </w:p>
-    <w:p>
-      <w:r>
-        <w:rPr>
-          <w:i/>
-        </w:rPr>
-        <w:t>│ - fechacambio          │</w:t>
-      </w:r>
-    </w:p>
-    <w:p>
-      <w:r>
-        <w:t>│ - comentario            │</w:t>
-      </w:r>
-    </w:p>
-    <w:p>
-      <w:r>
-        <w:t>└─────────────────────────┘</w:t>
-      </w:r>
-    </w:p>
-    <w:p/>
-    <w:p>
-      <w:r>
-        <w:t>┌─────────────────────────┐</w:t>
-      </w:r>
-    </w:p>
-    <w:p>
-      <w:r>
-        <w:rPr>
-          <w:i/>
-        </w:rPr>
-        <w:t>│   REGLANEGOCIO         │</w:t>
-      </w:r>
-    </w:p>
-    <w:p>
-      <w:r>
-        <w:t>├─────────────────────────┤</w:t>
-      </w:r>
-    </w:p>
-    <w:p>
-      <w:r>
-        <w:rPr>
-          <w:i/>
-        </w:rPr>
-        <w:t>│ - idregla              │</w:t>
-      </w:r>
-    </w:p>
-    <w:p>
-      <w:r>
-        <w:t>│ - condicion             │</w:t>
-      </w:r>
-    </w:p>
-    <w:p>
-      <w:r>
-        <w:t>│ - accion                │</w:t>
-      </w:r>
-    </w:p>
-    <w:p>
-      <w:r>
-        <w:rPr>
-          <w:i/>
-        </w:rPr>
-        <w:t>│ - prioridadasociada    │</w:t>
-      </w:r>
-    </w:p>
-    <w:p>
-      <w:r>
-        <w:t>│ - activa                │</w:t>
-      </w:r>
-    </w:p>
-    <w:p>
-      <w:r>
-        <w:t>└─────────────────────────┘</w:t>
-      </w:r>
-    </w:p>
-    <w:p>
-      <w:r>
-        <w:t>```</w:t>
-      </w:r>
-    </w:p>
-    <w:p/>
-    <w:p>
-      <w:r/>
-      <w:r>
-        <w:rPr>
-          <w:b/>
-        </w:rPr>
-        <w:t>El módulo de Inteligencia Artificial interviene en:</w:t>
-      </w:r>
-      <w:r/>
-    </w:p>
-    <w:p/>
-    <w:p>
-      <w:r>
-        <w:t>Análisis de la descripción del incidente mediante NLP</w:t>
-      </w:r>
-    </w:p>
-    <w:p>
-      <w:r>
-        <w:t>Generación de embeddings semánticos para búsqueda de similitud</w:t>
-      </w:r>
-    </w:p>
-    <w:p>
-      <w:r>
-        <w:t>Clasificación automática de categoría y prioridad</w:t>
-      </w:r>
-    </w:p>
-    <w:p>
-      <w:r>
-        <w:t>Predicción del nivel de urgencia basada en patrones históricos</w:t>
-      </w:r>
-    </w:p>
-    <w:p>
-      <w:r>
-        <w:t>Justificación de decisiones para mayor transparencia</w:t>
-      </w:r>
-    </w:p>
-    <w:p/>
-    <w:p>
-      <w:r>
-        <w:t>---</w:t>
+    <w:p>
+      <w:pPr>
+        <w:jc w:val="center"/>
+      </w:pPr>
+      <w:r>
+        <w:drawing>
+          <wp:inline xmlns:a="http://schemas.openxmlformats.org/drawingml/2006/main" xmlns:pic="http://schemas.openxmlformats.org/drawingml/2006/picture">
+            <wp:extent cx="5486400" cy="4893686"/>
+            <wp:docPr id="1423509515" name="Picture 1423509515"/>
+            <wp:cNvGraphicFramePr>
+              <a:graphicFrameLocks noChangeAspect="1"/>
+            </wp:cNvGraphicFramePr>
+            <a:graphic>
+              <a:graphicData uri="http://schemas.openxmlformats.org/drawingml/2006/picture">
+                <pic:pic>
+                  <pic:nvPicPr>
+                    <pic:cNvPr id="0" name="DiagramClass.png"/>
+                    <pic:cNvPicPr/>
+                  </pic:nvPicPr>
+                  <pic:blipFill>
+                    <a:blip r:embed="rId14"/>
+                    <a:stretch>
+                      <a:fillRect/>
+                    </a:stretch>
+                  </pic:blipFill>
+                  <pic:spPr>
+                    <a:xfrm>
+                      <a:off x="0" y="0"/>
+                      <a:ext cx="5486400" cy="4893686"/>
+                    </a:xfrm>
+                    <a:prstGeom prst="rect"/>
+                  </pic:spPr>
+                </pic:pic>
+              </a:graphicData>
+            </a:graphic>
+          </wp:inline>
+        </w:drawing>
       </w:r>
     </w:p>
     <w:p/>
@@ -1331,7 +1136,7 @@
         <w:drawing>
           <wp:inline xmlns:a="http://schemas.openxmlformats.org/drawingml/2006/main" xmlns:pic="http://schemas.openxmlformats.org/drawingml/2006/picture">
             <wp:extent cx="5486400" cy="13987691"/>
-            <wp:docPr id="1423509515" name="Picture 1423509515"/>
+            <wp:docPr id="1423509516" name="Picture 1423509516"/>
             <wp:cNvGraphicFramePr>
               <a:graphicFrameLocks noChangeAspect="1"/>
             </wp:cNvGraphicFramePr>
@@ -1343,7 +1148,7 @@
                     <pic:cNvPicPr/>
                   </pic:nvPicPr>
                   <pic:blipFill>
-                    <a:blip r:embed="rId14"/>
+                    <a:blip r:embed="rId15"/>
                     <a:stretch>
                       <a:fillRect/>
                     </a:stretch>
@@ -5854,7 +5659,6 @@
   <w:style w:type="character" w:default="1" w:styleId="Fuentedeprrafopredeter">
     <w:name w:val="Default Paragraph Font"/>
     <w:uiPriority w:val="1"/>
-    <w:semiHidden/>
     <w:unhideWhenUsed/>
   </w:style>
   <w:style w:type="table" w:default="1" w:styleId="Tablanormal">

</xml_diff>